<commit_message>
Sprint de fechamento: preços v1 nas propostas + 4 artefatos de execução
- Propostas de entrada (md + DOCX) e programa com os preços v1 oficiais
- cliente-zero-runbook.md: o ensaio geral dia a dia com critério de aprovação
- spec-alinhamento-assessment-web.md: ticket dev pronto com copy do CTA
- guia-producao-fisica.md: gravação dos 3 vídeos + specs de gráfica dos 6 cards
- pipeline-modelo.md: tracker de 20 alvos com fontes de prospecção

Co-Authored-By: Claude Fable 5 <noreply@anthropic.com>
Claude-Session: https://claude.ai/code/session_016RZJT8nVEB7u33HvjY5KvZ
</commit_message>
<xml_diff>
--- a/08-materiais/modelos/proposta-avaliacao-prontidao-modelo.docx
+++ b/08-materiais/modelos/proposta-avaliacao-prontidao-modelo.docx
@@ -716,7 +716,7 @@
           <w:sz w:val="22"/>
           <w:szCs w:val="22"/>
         </w:rPr>
-        <w:t xml:space="preserve">{{PRECO_AVALIACAO}}</w:t>
+        <w:t xml:space="preserve">R$ 28.000</w:t>
       </w:r>
       <w:r>
         <w:rPr>
@@ -729,7 +729,7 @@
           <w:sz w:val="22"/>
           <w:szCs w:val="22"/>
         </w:rPr>
-        <w:t xml:space="preserve"> — até 25 participantes. Ajustes por porte na tabela vigente. Faturamento: 50% na assinatura, 50% em até 10 dias úteis após o debrief.</w:t>
+        <w:t xml:space="preserve"> (faixa R$ 24–35 mil conforme porte) — até 25 participantes. Faturamento: 50% na assinatura, 50% em até 10 dias úteis após o debrief.</w:t>
       </w:r>
     </w:p>
     <w:p>

</xml_diff>